<commit_message>
Reword Q4 and Q5 to match anatomy/physiology pattern
Q1, Q2, Q3, Q6 all follow 'which anatomy/system/lab/code is
associated with disease X' pattern. Q4 and Q5 were coding-rule
questions that broke the pattern. Replaced:

  Q4  HCC re-documentation frequency
      → 'Which gland is underactive in Hypothyroidism (E03.9)?'

  Q5  COPD vs asthma clinical difference
      → 'Which lab value reflects diabetes control over 2-3 months?'

Both new questions cover common preventive-care dx (hypothyroidism
and diabetes), test true anatomy/physiology basics, and match the
pattern of the other questions. Answer key updated with matching
'why it matters for the biller' explanations.

Co-Authored-By: Claude Opus 4.7 <noreply@anthropic.com>
Claude-Session: https://claude.ai/code/session_01FQCsD1ZdbqSqbtLgYtoLBe
</commit_message>
<xml_diff>
--- a/docs/Billing_Team_AP_Baseline_Quiz.docx
+++ b/docs/Billing_Team_AP_Baseline_Quiz.docx
@@ -618,7 +618,7 @@
           <w:color w:val="0F172A"/>
           <w:sz w:val="22"/>
         </w:rPr>
-        <w:t>In Medicare Advantage risk adjustment, chronic conditions (HCCs) must be re-documented how often to be captured?</w:t>
+        <w:t>A patient's chart shows Hypothyroidism (E03.9). Which gland is not producing enough hormone?</w:t>
       </w:r>
     </w:p>
     <w:p>
@@ -646,7 +646,7 @@
           <w:color w:val="0F172A"/>
           <w:sz w:val="22"/>
         </w:rPr>
-        <w:t>Every 3 years</w:t>
+        <w:t>Pituitary gland</w:t>
       </w:r>
     </w:p>
     <w:p>
@@ -674,7 +674,7 @@
           <w:color w:val="0F172A"/>
           <w:sz w:val="22"/>
         </w:rPr>
-        <w:t>Every 5 years</w:t>
+        <w:t>Adrenal gland</w:t>
       </w:r>
     </w:p>
     <w:p>
@@ -702,7 +702,7 @@
           <w:color w:val="0F172A"/>
           <w:sz w:val="22"/>
         </w:rPr>
-        <w:t>Only when a patient changes providers</w:t>
+        <w:t>Thyroid gland</w:t>
       </w:r>
     </w:p>
     <w:p>
@@ -730,7 +730,7 @@
           <w:color w:val="0F172A"/>
           <w:sz w:val="22"/>
         </w:rPr>
-        <w:t>Every calendar year</w:t>
+        <w:t>Parathyroid gland</w:t>
       </w:r>
     </w:p>
     <w:p>
@@ -751,7 +751,7 @@
           <w:color w:val="0F172A"/>
           <w:sz w:val="22"/>
         </w:rPr>
-        <w:t>What is the KEY clinical difference between COPD (J44) and asthma (J45)?</w:t>
+        <w:t>When coding a diabetic patient, which lab value best reflects the patient's blood sugar control over the past 2–3 months?</w:t>
       </w:r>
     </w:p>
     <w:p>
@@ -779,7 +779,7 @@
           <w:color w:val="0F172A"/>
           <w:sz w:val="22"/>
         </w:rPr>
-        <w:t>COPD affects children only, asthma affects adults only</w:t>
+        <w:t>Fasting glucose</w:t>
       </w:r>
     </w:p>
     <w:p>
@@ -807,7 +807,7 @@
           <w:color w:val="0F172A"/>
           <w:sz w:val="22"/>
         </w:rPr>
-        <w:t>COPD causes largely irreversible airway obstruction; asthma is generally reversible</w:t>
+        <w:t>Random glucose</w:t>
       </w:r>
     </w:p>
     <w:p>
@@ -835,7 +835,7 @@
           <w:color w:val="0F172A"/>
           <w:sz w:val="22"/>
         </w:rPr>
-        <w:t>Asthma requires oxygen therapy; COPD does not</w:t>
+        <w:t>HbA1c (Hemoglobin A1c)</w:t>
       </w:r>
     </w:p>
     <w:p>
@@ -863,7 +863,7 @@
           <w:color w:val="0F172A"/>
           <w:sz w:val="22"/>
         </w:rPr>
-        <w:t>There is no difference between COPD and asthma</w:t>
+        <w:t>Postprandial glucose</w:t>
       </w:r>
     </w:p>
     <w:p>
@@ -1267,7 +1267,7 @@
               <w:rPr>
                 <w:sz w:val="21"/>
               </w:rPr>
-              <w:t>D — Every calendar year</w:t>
+              <w:t>C — Thyroid gland</w:t>
             </w:r>
           </w:p>
         </w:tc>
@@ -1281,7 +1281,7 @@
               <w:rPr>
                 <w:sz w:val="21"/>
               </w:rPr>
-              <w:t>This is why HCC recapture matters. If a biller doesn't understand this, they won't push providers to re-document annually.</w:t>
+              <w:t>Hypothyroidism means the thyroid is underactive. Knowing this helps recognize the significance of TSH labs and levothyroxine (Synthroid) as a marker of the diagnosis.</w:t>
             </w:r>
           </w:p>
         </w:tc>
@@ -1309,7 +1309,7 @@
               <w:rPr>
                 <w:sz w:val="21"/>
               </w:rPr>
-              <w:t>B — COPD irreversible / asthma reversible</w:t>
+              <w:t>C — HbA1c</w:t>
             </w:r>
           </w:p>
         </w:tc>
@@ -1322,7 +1322,7 @@
               <w:rPr>
                 <w:sz w:val="21"/>
               </w:rPr>
-              <w:t>Understanding this distinction helps catch when a note calls something one thing but the pattern really fits the other, and prompts a provider query.</w:t>
+              <w:t>HbA1c reflects average glucose over ~3 months and is the standard clinical marker of diabetes control. It drives CPT II codes 3044F / 3046F / 3051F / 3052F for quality reporting.</w:t>
             </w:r>
           </w:p>
         </w:tc>

</xml_diff>

<commit_message>
Extend quiz from 6 to 10 questions
Added 4 questions covering additional body systems and preventive-care
diagnoses to give a broader baseline:

  Q7   Asthma (J45)      → Respiratory system
  Q8   Depression (F32)  → PHQ-9 screening tool
  Q9   Osteoporosis      → DEXA (DXA) scan
  Q10  Heart Failure     → Ejection fraction (HFrEF vs HFpEF)

Updated:
  - Header score field: /6 → /10
  - Instructions: 6 questions → 10 questions
  - Answer key: added Q7-Q10 explanations
  - Scoring rubric: rebalanced for 10-point scale
    (10/10 Excellent · 8-9/10 Good · 6-7/10 Needs review ·
    ≤5/10 Requires structured education)

Co-Authored-By: Claude Opus 4.7 <noreply@anthropic.com>
Claude-Session: https://claude.ai/code/session_01FQCsD1ZdbqSqbtLgYtoLBe
</commit_message>
<xml_diff>
--- a/docs/Billing_Team_AP_Baseline_Quiz.docx
+++ b/docs/Billing_Team_AP_Baseline_Quiz.docx
@@ -153,7 +153,7 @@
         <w:rPr>
           <w:sz w:val="22"/>
         </w:rPr>
-        <w:t>• Answer each of the 6 questions by checking (☑) the box next to the best answer.</w:t>
+        <w:t>• Answer each of the 10 questions by checking (☑) the box next to the best answer.</w:t>
       </w:r>
     </w:p>
     <w:p>
@@ -1001,6 +1001,538 @@
     </w:p>
     <w:p>
       <w:pPr>
+        <w:spacing w:before="240" w:after="120"/>
+      </w:pPr>
+      <w:r>
+        <w:rPr>
+          <w:b/>
+          <w:color w:val="0F6E6E"/>
+          <w:sz w:val="24"/>
+        </w:rPr>
+        <w:t xml:space="preserve">7.  </w:t>
+      </w:r>
+      <w:r>
+        <w:rPr>
+          <w:b/>
+          <w:color w:val="0F172A"/>
+          <w:sz w:val="22"/>
+        </w:rPr>
+        <w:t>Asthma (J45) is a condition of which body system?</w:t>
+      </w:r>
+    </w:p>
+    <w:p>
+      <w:pPr>
+        <w:spacing w:after="60"/>
+        <w:ind w:left="576"/>
+      </w:pPr>
+      <w:r>
+        <w:rPr>
+          <w:color w:val="0F172A"/>
+          <w:sz w:val="24"/>
+        </w:rPr>
+        <w:t xml:space="preserve">☐  </w:t>
+      </w:r>
+      <w:r>
+        <w:rPr>
+          <w:b/>
+          <w:color w:val="0F6E6E"/>
+          <w:sz w:val="22"/>
+        </w:rPr>
+        <w:t xml:space="preserve">A.  </w:t>
+      </w:r>
+      <w:r>
+        <w:rPr>
+          <w:color w:val="0F172A"/>
+          <w:sz w:val="22"/>
+        </w:rPr>
+        <w:t>Cardiovascular</w:t>
+      </w:r>
+    </w:p>
+    <w:p>
+      <w:pPr>
+        <w:spacing w:after="60"/>
+        <w:ind w:left="576"/>
+      </w:pPr>
+      <w:r>
+        <w:rPr>
+          <w:color w:val="0F172A"/>
+          <w:sz w:val="24"/>
+        </w:rPr>
+        <w:t xml:space="preserve">☐  </w:t>
+      </w:r>
+      <w:r>
+        <w:rPr>
+          <w:b/>
+          <w:color w:val="0F6E6E"/>
+          <w:sz w:val="22"/>
+        </w:rPr>
+        <w:t xml:space="preserve">B.  </w:t>
+      </w:r>
+      <w:r>
+        <w:rPr>
+          <w:color w:val="0F172A"/>
+          <w:sz w:val="22"/>
+        </w:rPr>
+        <w:t>Respiratory</w:t>
+      </w:r>
+    </w:p>
+    <w:p>
+      <w:pPr>
+        <w:spacing w:after="60"/>
+        <w:ind w:left="576"/>
+      </w:pPr>
+      <w:r>
+        <w:rPr>
+          <w:color w:val="0F172A"/>
+          <w:sz w:val="24"/>
+        </w:rPr>
+        <w:t xml:space="preserve">☐  </w:t>
+      </w:r>
+      <w:r>
+        <w:rPr>
+          <w:b/>
+          <w:color w:val="0F6E6E"/>
+          <w:sz w:val="22"/>
+        </w:rPr>
+        <w:t xml:space="preserve">C.  </w:t>
+      </w:r>
+      <w:r>
+        <w:rPr>
+          <w:color w:val="0F172A"/>
+          <w:sz w:val="22"/>
+        </w:rPr>
+        <w:t>Digestive</w:t>
+      </w:r>
+    </w:p>
+    <w:p>
+      <w:pPr>
+        <w:spacing w:after="60"/>
+        <w:ind w:left="576"/>
+      </w:pPr>
+      <w:r>
+        <w:rPr>
+          <w:color w:val="0F172A"/>
+          <w:sz w:val="24"/>
+        </w:rPr>
+        <w:t xml:space="preserve">☐  </w:t>
+      </w:r>
+      <w:r>
+        <w:rPr>
+          <w:b/>
+          <w:color w:val="0F6E6E"/>
+          <w:sz w:val="22"/>
+        </w:rPr>
+        <w:t xml:space="preserve">D.  </w:t>
+      </w:r>
+      <w:r>
+        <w:rPr>
+          <w:color w:val="0F172A"/>
+          <w:sz w:val="22"/>
+        </w:rPr>
+        <w:t>Endocrine</w:t>
+      </w:r>
+    </w:p>
+    <w:p>
+      <w:pPr>
+        <w:spacing w:before="240" w:after="120"/>
+      </w:pPr>
+      <w:r>
+        <w:rPr>
+          <w:b/>
+          <w:color w:val="0F6E6E"/>
+          <w:sz w:val="24"/>
+        </w:rPr>
+        <w:t xml:space="preserve">8.  </w:t>
+      </w:r>
+      <w:r>
+        <w:rPr>
+          <w:b/>
+          <w:color w:val="0F172A"/>
+          <w:sz w:val="22"/>
+        </w:rPr>
+        <w:t>Which screening tool is most commonly used to measure the severity of Major Depressive Disorder (F32/F33)?</w:t>
+      </w:r>
+    </w:p>
+    <w:p>
+      <w:pPr>
+        <w:spacing w:after="60"/>
+        <w:ind w:left="576"/>
+      </w:pPr>
+      <w:r>
+        <w:rPr>
+          <w:color w:val="0F172A"/>
+          <w:sz w:val="24"/>
+        </w:rPr>
+        <w:t xml:space="preserve">☐  </w:t>
+      </w:r>
+      <w:r>
+        <w:rPr>
+          <w:b/>
+          <w:color w:val="0F6E6E"/>
+          <w:sz w:val="22"/>
+        </w:rPr>
+        <w:t xml:space="preserve">A.  </w:t>
+      </w:r>
+      <w:r>
+        <w:rPr>
+          <w:color w:val="0F172A"/>
+          <w:sz w:val="22"/>
+        </w:rPr>
+        <w:t>GAD-7</w:t>
+      </w:r>
+    </w:p>
+    <w:p>
+      <w:pPr>
+        <w:spacing w:after="60"/>
+        <w:ind w:left="576"/>
+      </w:pPr>
+      <w:r>
+        <w:rPr>
+          <w:color w:val="0F172A"/>
+          <w:sz w:val="24"/>
+        </w:rPr>
+        <w:t xml:space="preserve">☐  </w:t>
+      </w:r>
+      <w:r>
+        <w:rPr>
+          <w:b/>
+          <w:color w:val="0F6E6E"/>
+          <w:sz w:val="22"/>
+        </w:rPr>
+        <w:t xml:space="preserve">B.  </w:t>
+      </w:r>
+      <w:r>
+        <w:rPr>
+          <w:color w:val="0F172A"/>
+          <w:sz w:val="22"/>
+        </w:rPr>
+        <w:t>PHQ-9</w:t>
+      </w:r>
+    </w:p>
+    <w:p>
+      <w:pPr>
+        <w:spacing w:after="60"/>
+        <w:ind w:left="576"/>
+      </w:pPr>
+      <w:r>
+        <w:rPr>
+          <w:color w:val="0F172A"/>
+          <w:sz w:val="24"/>
+        </w:rPr>
+        <w:t xml:space="preserve">☐  </w:t>
+      </w:r>
+      <w:r>
+        <w:rPr>
+          <w:b/>
+          <w:color w:val="0F6E6E"/>
+          <w:sz w:val="22"/>
+        </w:rPr>
+        <w:t xml:space="preserve">C.  </w:t>
+      </w:r>
+      <w:r>
+        <w:rPr>
+          <w:color w:val="0F172A"/>
+          <w:sz w:val="22"/>
+        </w:rPr>
+        <w:t>BMI</w:t>
+      </w:r>
+    </w:p>
+    <w:p>
+      <w:pPr>
+        <w:spacing w:after="60"/>
+        <w:ind w:left="576"/>
+      </w:pPr>
+      <w:r>
+        <w:rPr>
+          <w:color w:val="0F172A"/>
+          <w:sz w:val="24"/>
+        </w:rPr>
+        <w:t xml:space="preserve">☐  </w:t>
+      </w:r>
+      <w:r>
+        <w:rPr>
+          <w:b/>
+          <w:color w:val="0F6E6E"/>
+          <w:sz w:val="22"/>
+        </w:rPr>
+        <w:t xml:space="preserve">D.  </w:t>
+      </w:r>
+      <w:r>
+        <w:rPr>
+          <w:color w:val="0F172A"/>
+          <w:sz w:val="22"/>
+        </w:rPr>
+        <w:t>HbA1c</w:t>
+      </w:r>
+    </w:p>
+    <w:p>
+      <w:pPr>
+        <w:spacing w:before="240" w:after="120"/>
+      </w:pPr>
+      <w:r>
+        <w:rPr>
+          <w:b/>
+          <w:color w:val="0F6E6E"/>
+          <w:sz w:val="24"/>
+        </w:rPr>
+        <w:t xml:space="preserve">9.  </w:t>
+      </w:r>
+      <w:r>
+        <w:rPr>
+          <w:b/>
+          <w:color w:val="0F172A"/>
+          <w:sz w:val="22"/>
+        </w:rPr>
+        <w:t>Which imaging test measures bone mineral density to diagnose Osteoporosis (M81.0)?</w:t>
+      </w:r>
+    </w:p>
+    <w:p>
+      <w:pPr>
+        <w:spacing w:after="60"/>
+        <w:ind w:left="576"/>
+      </w:pPr>
+      <w:r>
+        <w:rPr>
+          <w:color w:val="0F172A"/>
+          <w:sz w:val="24"/>
+        </w:rPr>
+        <w:t xml:space="preserve">☐  </w:t>
+      </w:r>
+      <w:r>
+        <w:rPr>
+          <w:b/>
+          <w:color w:val="0F6E6E"/>
+          <w:sz w:val="22"/>
+        </w:rPr>
+        <w:t xml:space="preserve">A.  </w:t>
+      </w:r>
+      <w:r>
+        <w:rPr>
+          <w:color w:val="0F172A"/>
+          <w:sz w:val="22"/>
+        </w:rPr>
+        <w:t>MRI</w:t>
+      </w:r>
+    </w:p>
+    <w:p>
+      <w:pPr>
+        <w:spacing w:after="60"/>
+        <w:ind w:left="576"/>
+      </w:pPr>
+      <w:r>
+        <w:rPr>
+          <w:color w:val="0F172A"/>
+          <w:sz w:val="24"/>
+        </w:rPr>
+        <w:t xml:space="preserve">☐  </w:t>
+      </w:r>
+      <w:r>
+        <w:rPr>
+          <w:b/>
+          <w:color w:val="0F6E6E"/>
+          <w:sz w:val="22"/>
+        </w:rPr>
+        <w:t xml:space="preserve">B.  </w:t>
+      </w:r>
+      <w:r>
+        <w:rPr>
+          <w:color w:val="0F172A"/>
+          <w:sz w:val="22"/>
+        </w:rPr>
+        <w:t>CT scan</w:t>
+      </w:r>
+    </w:p>
+    <w:p>
+      <w:pPr>
+        <w:spacing w:after="60"/>
+        <w:ind w:left="576"/>
+      </w:pPr>
+      <w:r>
+        <w:rPr>
+          <w:color w:val="0F172A"/>
+          <w:sz w:val="24"/>
+        </w:rPr>
+        <w:t xml:space="preserve">☐  </w:t>
+      </w:r>
+      <w:r>
+        <w:rPr>
+          <w:b/>
+          <w:color w:val="0F6E6E"/>
+          <w:sz w:val="22"/>
+        </w:rPr>
+        <w:t xml:space="preserve">C.  </w:t>
+      </w:r>
+      <w:r>
+        <w:rPr>
+          <w:color w:val="0F172A"/>
+          <w:sz w:val="22"/>
+        </w:rPr>
+        <w:t>DEXA (DXA) scan</w:t>
+      </w:r>
+    </w:p>
+    <w:p>
+      <w:pPr>
+        <w:spacing w:after="60"/>
+        <w:ind w:left="576"/>
+      </w:pPr>
+      <w:r>
+        <w:rPr>
+          <w:color w:val="0F172A"/>
+          <w:sz w:val="24"/>
+        </w:rPr>
+        <w:t xml:space="preserve">☐  </w:t>
+      </w:r>
+      <w:r>
+        <w:rPr>
+          <w:b/>
+          <w:color w:val="0F6E6E"/>
+          <w:sz w:val="22"/>
+        </w:rPr>
+        <w:t xml:space="preserve">D.  </w:t>
+      </w:r>
+      <w:r>
+        <w:rPr>
+          <w:color w:val="0F172A"/>
+          <w:sz w:val="22"/>
+        </w:rPr>
+        <w:t>Ultrasound</w:t>
+      </w:r>
+    </w:p>
+    <w:p>
+      <w:pPr>
+        <w:spacing w:before="240" w:after="120"/>
+      </w:pPr>
+      <w:r>
+        <w:rPr>
+          <w:b/>
+          <w:color w:val="0F6E6E"/>
+          <w:sz w:val="24"/>
+        </w:rPr>
+        <w:t xml:space="preserve">10.  </w:t>
+      </w:r>
+      <w:r>
+        <w:rPr>
+          <w:b/>
+          <w:color w:val="0F172A"/>
+          <w:sz w:val="22"/>
+        </w:rPr>
+        <w:t>When coding Heart Failure (I50.-), which measurement distinguishes HFrEF (reduced ejection fraction) from HFpEF (preserved ejection fraction)?</w:t>
+      </w:r>
+    </w:p>
+    <w:p>
+      <w:pPr>
+        <w:spacing w:after="60"/>
+        <w:ind w:left="576"/>
+      </w:pPr>
+      <w:r>
+        <w:rPr>
+          <w:color w:val="0F172A"/>
+          <w:sz w:val="24"/>
+        </w:rPr>
+        <w:t xml:space="preserve">☐  </w:t>
+      </w:r>
+      <w:r>
+        <w:rPr>
+          <w:b/>
+          <w:color w:val="0F6E6E"/>
+          <w:sz w:val="22"/>
+        </w:rPr>
+        <w:t xml:space="preserve">A.  </w:t>
+      </w:r>
+      <w:r>
+        <w:rPr>
+          <w:color w:val="0F172A"/>
+          <w:sz w:val="22"/>
+        </w:rPr>
+        <w:t>Blood pressure</w:t>
+      </w:r>
+    </w:p>
+    <w:p>
+      <w:pPr>
+        <w:spacing w:after="60"/>
+        <w:ind w:left="576"/>
+      </w:pPr>
+      <w:r>
+        <w:rPr>
+          <w:color w:val="0F172A"/>
+          <w:sz w:val="24"/>
+        </w:rPr>
+        <w:t xml:space="preserve">☐  </w:t>
+      </w:r>
+      <w:r>
+        <w:rPr>
+          <w:b/>
+          <w:color w:val="0F6E6E"/>
+          <w:sz w:val="22"/>
+        </w:rPr>
+        <w:t xml:space="preserve">B.  </w:t>
+      </w:r>
+      <w:r>
+        <w:rPr>
+          <w:color w:val="0F172A"/>
+          <w:sz w:val="22"/>
+        </w:rPr>
+        <w:t>Heart rate</w:t>
+      </w:r>
+    </w:p>
+    <w:p>
+      <w:pPr>
+        <w:spacing w:after="60"/>
+        <w:ind w:left="576"/>
+      </w:pPr>
+      <w:r>
+        <w:rPr>
+          <w:color w:val="0F172A"/>
+          <w:sz w:val="24"/>
+        </w:rPr>
+        <w:t xml:space="preserve">☐  </w:t>
+      </w:r>
+      <w:r>
+        <w:rPr>
+          <w:b/>
+          <w:color w:val="0F6E6E"/>
+          <w:sz w:val="22"/>
+        </w:rPr>
+        <w:t xml:space="preserve">C.  </w:t>
+      </w:r>
+      <w:r>
+        <w:rPr>
+          <w:color w:val="0F172A"/>
+          <w:sz w:val="22"/>
+        </w:rPr>
+        <w:t>Ejection fraction (EF)</w:t>
+      </w:r>
+    </w:p>
+    <w:p>
+      <w:pPr>
+        <w:spacing w:after="60"/>
+        <w:ind w:left="576"/>
+      </w:pPr>
+      <w:r>
+        <w:rPr>
+          <w:color w:val="0F172A"/>
+          <w:sz w:val="24"/>
+        </w:rPr>
+        <w:t xml:space="preserve">☐  </w:t>
+      </w:r>
+      <w:r>
+        <w:rPr>
+          <w:b/>
+          <w:color w:val="0F6E6E"/>
+          <w:sz w:val="22"/>
+        </w:rPr>
+        <w:t xml:space="preserve">D.  </w:t>
+      </w:r>
+      <w:r>
+        <w:rPr>
+          <w:color w:val="0F172A"/>
+          <w:sz w:val="22"/>
+        </w:rPr>
+        <w:t>BMI</w:t>
+      </w:r>
+    </w:p>
+    <w:p>
+      <w:pPr>
         <w:spacing w:before="400"/>
       </w:pPr>
       <w:r>
@@ -1371,6 +1903,176 @@
           </w:p>
         </w:tc>
       </w:tr>
+      <w:tr>
+        <w:tc>
+          <w:tcPr>
+            <w:tcW w:type="dxa" w:w="576"/>
+          </w:tcPr>
+          <w:p>
+            <w:r>
+              <w:rPr>
+                <w:sz w:val="21"/>
+              </w:rPr>
+              <w:t>7</w:t>
+            </w:r>
+          </w:p>
+        </w:tc>
+        <w:tc>
+          <w:tcPr>
+            <w:tcW w:type="dxa" w:w="2592"/>
+          </w:tcPr>
+          <w:p>
+            <w:r>
+              <w:rPr>
+                <w:sz w:val="21"/>
+              </w:rPr>
+              <w:t>B — Respiratory</w:t>
+            </w:r>
+          </w:p>
+        </w:tc>
+        <w:tc>
+          <w:tcPr>
+            <w:tcW w:type="dxa" w:w="6048"/>
+          </w:tcPr>
+          <w:p>
+            <w:r>
+              <w:rPr>
+                <w:sz w:val="21"/>
+              </w:rPr>
+              <w:t>Asthma codes to a respiratory condition. Knowing this helps recognize related documentation (bronchodilators, spirometry) and separate asthma from cardiovascular causes of shortness of breath.</w:t>
+            </w:r>
+          </w:p>
+        </w:tc>
+      </w:tr>
+      <w:tr>
+        <w:tc>
+          <w:tcPr>
+            <w:tcW w:type="dxa" w:w="576"/>
+            <w:shd w:fill="F1F8F7"/>
+          </w:tcPr>
+          <w:p>
+            <w:r>
+              <w:rPr>
+                <w:sz w:val="21"/>
+              </w:rPr>
+              <w:t>8</w:t>
+            </w:r>
+          </w:p>
+        </w:tc>
+        <w:tc>
+          <w:tcPr>
+            <w:tcW w:type="dxa" w:w="2592"/>
+            <w:shd w:fill="F1F8F7"/>
+          </w:tcPr>
+          <w:p>
+            <w:r>
+              <w:rPr>
+                <w:sz w:val="21"/>
+              </w:rPr>
+              <w:t>B — PHQ-9</w:t>
+            </w:r>
+          </w:p>
+        </w:tc>
+        <w:tc>
+          <w:tcPr>
+            <w:tcW w:type="dxa" w:w="6048"/>
+            <w:shd w:fill="F1F8F7"/>
+          </w:tcPr>
+          <w:p>
+            <w:r>
+              <w:rPr>
+                <w:sz w:val="21"/>
+              </w:rPr>
+              <w:t>PHQ-9 is the standard depression severity screen and drives CPT II 3725F / G8431. GAD-7 (choice A) is for anxiety. Knowing the difference prevents miscoding the screening measure.</w:t>
+            </w:r>
+          </w:p>
+        </w:tc>
+      </w:tr>
+      <w:tr>
+        <w:tc>
+          <w:tcPr>
+            <w:tcW w:type="dxa" w:w="576"/>
+          </w:tcPr>
+          <w:p>
+            <w:r>
+              <w:rPr>
+                <w:sz w:val="21"/>
+              </w:rPr>
+              <w:t>9</w:t>
+            </w:r>
+          </w:p>
+        </w:tc>
+        <w:tc>
+          <w:tcPr>
+            <w:tcW w:type="dxa" w:w="2592"/>
+          </w:tcPr>
+          <w:p>
+            <w:r>
+              <w:rPr>
+                <w:sz w:val="21"/>
+              </w:rPr>
+              <w:t>C — DEXA (DXA) scan</w:t>
+            </w:r>
+          </w:p>
+        </w:tc>
+        <w:tc>
+          <w:tcPr>
+            <w:tcW w:type="dxa" w:w="6048"/>
+          </w:tcPr>
+          <w:p>
+            <w:r>
+              <w:rPr>
+                <w:sz w:val="21"/>
+              </w:rPr>
+              <w:t>DEXA is the gold-standard bone density test for osteoporosis. Recognizing it in the note lets the biller capture CPT II 3095F (DXA completed) or 3096F (DXA ordered).</w:t>
+            </w:r>
+          </w:p>
+        </w:tc>
+      </w:tr>
+      <w:tr>
+        <w:tc>
+          <w:tcPr>
+            <w:tcW w:type="dxa" w:w="576"/>
+            <w:shd w:fill="F1F8F7"/>
+          </w:tcPr>
+          <w:p>
+            <w:r>
+              <w:rPr>
+                <w:sz w:val="21"/>
+              </w:rPr>
+              <w:t>10</w:t>
+            </w:r>
+          </w:p>
+        </w:tc>
+        <w:tc>
+          <w:tcPr>
+            <w:tcW w:type="dxa" w:w="2592"/>
+            <w:shd w:fill="F1F8F7"/>
+          </w:tcPr>
+          <w:p>
+            <w:r>
+              <w:rPr>
+                <w:sz w:val="21"/>
+              </w:rPr>
+              <w:t>C — Ejection fraction (EF)</w:t>
+            </w:r>
+          </w:p>
+        </w:tc>
+        <w:tc>
+          <w:tcPr>
+            <w:tcW w:type="dxa" w:w="6048"/>
+            <w:shd w:fill="F1F8F7"/>
+          </w:tcPr>
+          <w:p>
+            <w:r>
+              <w:rPr>
+                <w:sz w:val="21"/>
+              </w:rPr>
+              <w:t>EF from echocardiogram is what makes I50.22 (systolic/HFrEF), I50.32 (diastolic/HFpEF), and I50.42 (combined) an HCC. Without EF documentation, HF gets coded as unspecified (I50.9) and loses HCC value.</w:t>
+            </w:r>
+          </w:p>
+        </w:tc>
+      </w:tr>
     </w:tbl>
     <w:p>
       <w:pPr>
@@ -1456,7 +2158,7 @@
               <w:rPr>
                 <w:sz w:val="21"/>
               </w:rPr>
-              <w:t>6 / 6</w:t>
+              <w:t>10 / 10</w:t>
             </w:r>
           </w:p>
         </w:tc>
@@ -1498,7 +2200,7 @@
               <w:rPr>
                 <w:sz w:val="21"/>
               </w:rPr>
-              <w:t>5 / 6</w:t>
+              <w:t>8 – 9 / 10</w:t>
             </w:r>
           </w:p>
         </w:tc>
@@ -1526,7 +2228,7 @@
               <w:rPr>
                 <w:sz w:val="21"/>
               </w:rPr>
-              <w:t>Review the one missed topic + related codes</w:t>
+              <w:t>Review the missed topic(s) + related codes</w:t>
             </w:r>
           </w:p>
         </w:tc>
@@ -1541,7 +2243,7 @@
               <w:rPr>
                 <w:sz w:val="21"/>
               </w:rPr>
-              <w:t>4 / 6</w:t>
+              <w:t>6 – 7 / 10</w:t>
             </w:r>
           </w:p>
         </w:tc>
@@ -1583,7 +2285,7 @@
               <w:rPr>
                 <w:sz w:val="21"/>
               </w:rPr>
-              <w:t>3 / 6 or below</w:t>
+              <w:t>5 / 10 or below</w:t>
             </w:r>
           </w:p>
         </w:tc>
@@ -1611,7 +2313,7 @@
               <w:rPr>
                 <w:sz w:val="21"/>
               </w:rPr>
-              <w:t>1-hour group review of body-systems 1-6 in the manual before next audit cycle</w:t>
+              <w:t>1-hour group review of the full Anatomy &amp; Physiology section of the manual before next audit cycle</w:t>
             </w:r>
           </w:p>
         </w:tc>

</xml_diff>

<commit_message>
Rebalance quiz difficulty — Q7 harder, Q10 easier
Q7 (Asthma):
  Was: 'Asthma is a condition of which body system?' (too easy —
       matched Q2 difficulty for HTN)
  Now: 'What physiological change causes shortness of breath and
       wheezing in asthma?' (tests understanding of bronchial
       constriction + inflammation, not just system naming)

Q10 (Heart Failure):
  Was: 'Which measurement distinguishes HFrEF from HFpEF?'
       (too advanced — required knowing EF terminology)
  Now: 'In Heart Failure, which organ is not working properly?'
       (basic organ recognition, matching Q1/Q4 difficulty)

Answer key explanations updated to reflect the new question
content and preserve 'why it matters for the biller' context.

Co-Authored-By: Claude Opus 4.7 <noreply@anthropic.com>
Claude-Session: https://claude.ai/code/session_01FQCsD1ZdbqSqbtLgYtoLBe
</commit_message>
<xml_diff>
--- a/docs/Billing_Team_AP_Baseline_Quiz.docx
+++ b/docs/Billing_Team_AP_Baseline_Quiz.docx
@@ -1017,7 +1017,7 @@
           <w:color w:val="0F172A"/>
           <w:sz w:val="22"/>
         </w:rPr>
-        <w:t>Asthma (J45) is a condition of which body system?</w:t>
+        <w:t>In Asthma (J45), what physiological change causes the shortness of breath and wheezing?</w:t>
       </w:r>
     </w:p>
     <w:p>
@@ -1045,7 +1045,7 @@
           <w:color w:val="0F172A"/>
           <w:sz w:val="22"/>
         </w:rPr>
-        <w:t>Cardiovascular</w:t>
+        <w:t>The alveoli fill with blood</w:t>
       </w:r>
     </w:p>
     <w:p>
@@ -1073,7 +1073,7 @@
           <w:color w:val="0F172A"/>
           <w:sz w:val="22"/>
         </w:rPr>
-        <w:t>Respiratory</w:t>
+        <w:t>The bronchial airways narrow due to inflammation and muscle constriction</w:t>
       </w:r>
     </w:p>
     <w:p>
@@ -1101,7 +1101,7 @@
           <w:color w:val="0F172A"/>
           <w:sz w:val="22"/>
         </w:rPr>
-        <w:t>Digestive</w:t>
+        <w:t>The heart pumps too fast</w:t>
       </w:r>
     </w:p>
     <w:p>
@@ -1129,7 +1129,7 @@
           <w:color w:val="0F172A"/>
           <w:sz w:val="22"/>
         </w:rPr>
-        <w:t>Endocrine</w:t>
+        <w:t>The pleural space fills with fluid</w:t>
       </w:r>
     </w:p>
     <w:p>
@@ -1416,7 +1416,7 @@
           <w:color w:val="0F172A"/>
           <w:sz w:val="22"/>
         </w:rPr>
-        <w:t>When coding Heart Failure (I50.-), which measurement distinguishes HFrEF (reduced ejection fraction) from HFpEF (preserved ejection fraction)?</w:t>
+        <w:t>In Heart Failure (I50), which organ is not working properly?</w:t>
       </w:r>
     </w:p>
     <w:p>
@@ -1444,7 +1444,7 @@
           <w:color w:val="0F172A"/>
           <w:sz w:val="22"/>
         </w:rPr>
-        <w:t>Blood pressure</w:t>
+        <w:t>Kidney</w:t>
       </w:r>
     </w:p>
     <w:p>
@@ -1472,7 +1472,7 @@
           <w:color w:val="0F172A"/>
           <w:sz w:val="22"/>
         </w:rPr>
-        <w:t>Heart rate</w:t>
+        <w:t>Liver</w:t>
       </w:r>
     </w:p>
     <w:p>
@@ -1500,7 +1500,7 @@
           <w:color w:val="0F172A"/>
           <w:sz w:val="22"/>
         </w:rPr>
-        <w:t>Ejection fraction (EF)</w:t>
+        <w:t>Heart</w:t>
       </w:r>
     </w:p>
     <w:p>
@@ -1528,7 +1528,7 @@
           <w:color w:val="0F172A"/>
           <w:sz w:val="22"/>
         </w:rPr>
-        <w:t>BMI</w:t>
+        <w:t>Pancreas</w:t>
       </w:r>
     </w:p>
     <w:p>
@@ -1926,7 +1926,7 @@
               <w:rPr>
                 <w:sz w:val="21"/>
               </w:rPr>
-              <w:t>B — Respiratory</w:t>
+              <w:t>B — Bronchial airways narrow due to inflammation and muscle constriction</w:t>
             </w:r>
           </w:p>
         </w:tc>
@@ -1939,7 +1939,7 @@
               <w:rPr>
                 <w:sz w:val="21"/>
               </w:rPr>
-              <w:t>Asthma codes to a respiratory condition. Knowing this helps recognize related documentation (bronchodilators, spirometry) and separate asthma from cardiovascular causes of shortness of breath.</w:t>
+              <w:t>In asthma, the bronchial airways constrict AND become inflamed — that's why bronchodilators (albuterol) and inhaled steroids (fluticasone) are both used. Understanding this helps the biller recognize why treatment involves both med classes and why severity depends on how often airways constrict.</w:t>
             </w:r>
           </w:p>
         </w:tc>
@@ -2054,7 +2054,7 @@
               <w:rPr>
                 <w:sz w:val="21"/>
               </w:rPr>
-              <w:t>C — Ejection fraction (EF)</w:t>
+              <w:t>C — Heart</w:t>
             </w:r>
           </w:p>
         </w:tc>
@@ -2068,7 +2068,7 @@
               <w:rPr>
                 <w:sz w:val="21"/>
               </w:rPr>
-              <w:t>EF from echocardiogram is what makes I50.22 (systolic/HFrEF), I50.32 (diastolic/HFpEF), and I50.42 (combined) an HCC. Without EF documentation, HF gets coded as unspecified (I50.9) and loses HCC value.</w:t>
+              <w:t>Heart Failure means the heart can't pump enough blood to meet the body's needs. This foundational understanding is what tells the biller to look for related documentation like ejection fraction (EF), BNP, diuretics, and to push for specificity (systolic vs diastolic) — the difference between I50.9 unspecified and an HCC-carrying code.</w:t>
             </w:r>
           </w:p>
         </w:tc>

</xml_diff>